<commit_message>
Show checkmarks in analysis results
</commit_message>
<xml_diff>
--- a/src/templates/question-analysis-template.docx
+++ b/src/templates/question-analysis-template.docx
@@ -249,6 +249,194 @@
         <w:pStyle w:val="Heading1"/>
         <w:rPr>
           <w:rStyle w:val="Emphasis"/>
+          <w:rFonts w:ascii="TH SarabunPSK" w:hAnsi="TH SarabunPSK" w:cs="TH SarabunPSK"/>
+          <w:i w:val="0"/>
+          <w:iCs w:val="0"/>
+          <w:sz w:val="48"/>
+          <w:szCs w:val="48"/>
+          <w:cs/>
+        </w:rPr>
+      </w:pPr>
+      <w:r>
+        <w:rPr>
+          <w:rStyle w:val="Emphasis"/>
+          <w:rFonts w:ascii="TH SarabunPSK" w:hAnsi="TH SarabunPSK" w:cs="TH SarabunPSK"/>
+          <w:i w:val="0"/>
+          <w:iCs w:val="0"/>
+          <w:sz w:val="48"/>
+          <w:szCs w:val="48"/>
+          <w:cs/>
+        </w:rPr>
+        <w:t xml:space="preserve">รายวิชา  </w:t>
+      </w:r>
+      <w:r>
+        <w:rPr>
+          <w:rFonts w:ascii="TH SarabunPSK" w:hAnsi="TH SarabunPSK" w:cs="TH SarabunPSK"/>
+          <w:sz w:val="48"/>
+          <w:szCs w:val="48"/>
+        </w:rPr>
+        <w:t>{{</w:t>
+      </w:r>
+      <w:proofErr w:type="spellStart"/>
+      <w:r>
+        <w:rPr>
+          <w:rFonts w:ascii="TH SarabunPSK" w:hAnsi="TH SarabunPSK" w:cs="TH SarabunPSK"/>
+          <w:sz w:val="48"/>
+          <w:szCs w:val="48"/>
+        </w:rPr>
+        <w:t>course_name</w:t>
+      </w:r>
+      <w:proofErr w:type="spellEnd"/>
+      <w:r>
+        <w:rPr>
+          <w:rFonts w:ascii="TH SarabunPSK" w:hAnsi="TH SarabunPSK" w:cs="TH SarabunPSK"/>
+          <w:sz w:val="48"/>
+          <w:szCs w:val="48"/>
+        </w:rPr>
+        <w:t>}}</w:t>
+      </w:r>
+    </w:p>
+    <w:p>
+      <w:pPr>
+        <w:pStyle w:val="Heading1"/>
+        <w:rPr>
+          <w:rStyle w:val="Emphasis"/>
+          <w:rFonts w:ascii="TH SarabunPSK" w:hAnsi="TH SarabunPSK" w:cs="TH SarabunPSK"/>
+          <w:i w:val="0"/>
+          <w:iCs w:val="0"/>
+          <w:sz w:val="48"/>
+          <w:szCs w:val="48"/>
+        </w:rPr>
+      </w:pPr>
+      <w:r>
+        <w:rPr>
+          <w:rStyle w:val="Emphasis"/>
+          <w:rFonts w:ascii="TH SarabunPSK" w:hAnsi="TH SarabunPSK" w:cs="TH SarabunPSK"/>
+          <w:i w:val="0"/>
+          <w:iCs w:val="0"/>
+          <w:sz w:val="48"/>
+          <w:szCs w:val="48"/>
+          <w:cs/>
+        </w:rPr>
+        <w:t xml:space="preserve">รหัสวิชา  </w:t>
+      </w:r>
+      <w:r>
+        <w:rPr>
+          <w:rFonts w:ascii="TH SarabunPSK" w:hAnsi="TH SarabunPSK" w:cs="TH SarabunPSK"/>
+          <w:sz w:val="48"/>
+          <w:szCs w:val="48"/>
+        </w:rPr>
+        <w:t>{{</w:t>
+      </w:r>
+      <w:proofErr w:type="spellStart"/>
+      <w:r>
+        <w:rPr>
+          <w:rFonts w:ascii="TH SarabunPSK" w:hAnsi="TH SarabunPSK" w:cs="TH SarabunPSK"/>
+          <w:sz w:val="48"/>
+          <w:szCs w:val="48"/>
+        </w:rPr>
+        <w:t>course_code</w:t>
+      </w:r>
+      <w:proofErr w:type="spellEnd"/>
+      <w:r>
+        <w:rPr>
+          <w:rFonts w:ascii="TH SarabunPSK" w:hAnsi="TH SarabunPSK" w:cs="TH SarabunPSK"/>
+          <w:sz w:val="48"/>
+          <w:szCs w:val="48"/>
+        </w:rPr>
+        <w:t>}}</w:t>
+      </w:r>
+    </w:p>
+    <w:p>
+      <w:pPr>
+        <w:pStyle w:val="Heading1"/>
+        <w:rPr>
+          <w:rStyle w:val="Emphasis"/>
+          <w:rFonts w:ascii="TH SarabunPSK" w:hAnsi="TH SarabunPSK" w:cs="TH SarabunPSK"/>
+          <w:i w:val="0"/>
+          <w:iCs w:val="0"/>
+          <w:sz w:val="48"/>
+          <w:szCs w:val="48"/>
+        </w:rPr>
+      </w:pPr>
+    </w:p>
+    <w:p/>
+    <w:p>
+      <w:pPr>
+        <w:pStyle w:val="Heading1"/>
+        <w:rPr>
+          <w:rStyle w:val="Emphasis"/>
+          <w:rFonts w:ascii="TH SarabunPSK" w:hAnsi="TH SarabunPSK" w:cs="TH SarabunPSK"/>
+          <w:i w:val="0"/>
+          <w:iCs w:val="0"/>
+          <w:sz w:val="48"/>
+          <w:szCs w:val="48"/>
+        </w:rPr>
+      </w:pPr>
+      <w:r>
+        <w:rPr>
+          <w:rStyle w:val="Emphasis"/>
+          <w:rFonts w:ascii="TH SarabunPSK" w:hAnsi="TH SarabunPSK" w:cs="TH SarabunPSK"/>
+          <w:i w:val="0"/>
+          <w:iCs w:val="0"/>
+          <w:sz w:val="48"/>
+          <w:szCs w:val="48"/>
+          <w:cs/>
+        </w:rPr>
+        <w:t>ระดับ</w:t>
+      </w:r>
+      <w:r>
+        <w:rPr>
+          <w:rStyle w:val="Emphasis"/>
+          <w:rFonts w:ascii="TH SarabunPSK" w:hAnsi="TH SarabunPSK" w:cs="TH SarabunPSK"/>
+          <w:i w:val="0"/>
+          <w:iCs w:val="0"/>
+          <w:sz w:val="48"/>
+          <w:szCs w:val="48"/>
+        </w:rPr>
+        <w:t xml:space="preserve"> </w:t>
+      </w:r>
+      <w:r>
+        <w:rPr>
+          <w:rFonts w:ascii="TH SarabunPSK" w:hAnsi="TH SarabunPSK" w:cs="TH SarabunPSK"/>
+          <w:sz w:val="48"/>
+          <w:szCs w:val="48"/>
+        </w:rPr>
+        <w:t>{{</w:t>
+      </w:r>
+      <w:proofErr w:type="spellStart"/>
+      <w:r>
+        <w:rPr>
+          <w:rFonts w:ascii="TH SarabunPSK" w:hAnsi="TH SarabunPSK" w:cs="TH SarabunPSK"/>
+          <w:sz w:val="48"/>
+          <w:szCs w:val="48"/>
+        </w:rPr>
+        <w:t>education_level</w:t>
+      </w:r>
+      <w:proofErr w:type="spellEnd"/>
+      <w:r>
+        <w:rPr>
+          <w:rFonts w:ascii="TH SarabunPSK" w:hAnsi="TH SarabunPSK" w:cs="TH SarabunPSK"/>
+          <w:sz w:val="48"/>
+          <w:szCs w:val="48"/>
+        </w:rPr>
+        <w:t>}}</w:t>
+      </w:r>
+      <w:r>
+        <w:rPr>
+          <w:rStyle w:val="Emphasis"/>
+          <w:rFonts w:ascii="TH SarabunPSK" w:hAnsi="TH SarabunPSK" w:cs="TH SarabunPSK"/>
+          <w:i w:val="0"/>
+          <w:iCs w:val="0"/>
+          <w:sz w:val="48"/>
+          <w:szCs w:val="48"/>
+          <w:cs/>
+        </w:rPr>
+        <w:t xml:space="preserve"> ชั้นปี</w:t>
+      </w:r>
+      <w:r>
+        <w:rPr>
+          <w:rStyle w:val="Emphasis"/>
           <w:rFonts w:ascii="TH SarabunPSK" w:hAnsi="TH SarabunPSK" w:cs="TH SarabunPSK" w:hint="cs"/>
           <w:i w:val="0"/>
           <w:iCs w:val="0"/>
@@ -256,7 +444,8 @@
           <w:szCs w:val="48"/>
           <w:cs/>
         </w:rPr>
-      </w:pPr>
+        <w:t>ที่</w:t>
+      </w:r>
       <w:r>
         <w:rPr>
           <w:rStyle w:val="Emphasis"/>
@@ -265,40 +454,10 @@
           <w:iCs w:val="0"/>
           <w:sz w:val="48"/>
           <w:szCs w:val="48"/>
-          <w:cs/>
-        </w:rPr>
-        <w:t xml:space="preserve">รายวิชา  </w:t>
-      </w:r>
-      <w:r>
-        <w:rPr>
-          <w:rFonts w:ascii="TH SarabunPSK" w:hAnsi="TH SarabunPSK" w:cs="TH SarabunPSK"/>
-          <w:sz w:val="48"/>
-          <w:szCs w:val="48"/>
-        </w:rPr>
-        <w:t>{{</w:t>
-      </w:r>
-      <w:proofErr w:type="spellStart"/>
-      <w:r>
-        <w:rPr>
-          <w:rFonts w:ascii="TH SarabunPSK" w:hAnsi="TH SarabunPSK" w:cs="TH SarabunPSK"/>
-          <w:sz w:val="48"/>
-          <w:szCs w:val="48"/>
-        </w:rPr>
-        <w:t>course_name</w:t>
-      </w:r>
-      <w:proofErr w:type="spellEnd"/>
-      <w:r>
-        <w:rPr>
-          <w:rFonts w:ascii="TH SarabunPSK" w:hAnsi="TH SarabunPSK" w:cs="TH SarabunPSK"/>
-          <w:sz w:val="48"/>
-          <w:szCs w:val="48"/>
-        </w:rPr>
-        <w:t>}}</w:t>
-      </w:r>
-    </w:p>
-    <w:p>
-      <w:pPr>
-        <w:pStyle w:val="Heading1"/>
+        </w:rPr>
+        <w:t xml:space="preserve"> </w:t>
+      </w:r>
+      <w:r>
         <w:rPr>
           <w:rStyle w:val="Emphasis"/>
           <w:rFonts w:ascii="TH SarabunPSK" w:hAnsi="TH SarabunPSK" w:cs="TH SarabunPSK"/>
@@ -307,7 +466,9 @@
           <w:sz w:val="48"/>
           <w:szCs w:val="48"/>
         </w:rPr>
-      </w:pPr>
+        <w:t>{{</w:t>
+      </w:r>
+      <w:proofErr w:type="spellStart"/>
       <w:r>
         <w:rPr>
           <w:rStyle w:val="Emphasis"/>
@@ -316,40 +477,11 @@
           <w:iCs w:val="0"/>
           <w:sz w:val="48"/>
           <w:szCs w:val="48"/>
-          <w:cs/>
-        </w:rPr>
-        <w:t xml:space="preserve">รหัสวิชา  </w:t>
-      </w:r>
-      <w:r>
-        <w:rPr>
-          <w:rFonts w:ascii="TH SarabunPSK" w:hAnsi="TH SarabunPSK" w:cs="TH SarabunPSK"/>
-          <w:sz w:val="48"/>
-          <w:szCs w:val="48"/>
-        </w:rPr>
-        <w:t>{{</w:t>
-      </w:r>
-      <w:proofErr w:type="spellStart"/>
-      <w:r>
-        <w:rPr>
-          <w:rFonts w:ascii="TH SarabunPSK" w:hAnsi="TH SarabunPSK" w:cs="TH SarabunPSK"/>
-          <w:sz w:val="48"/>
-          <w:szCs w:val="48"/>
-        </w:rPr>
-        <w:t>course_code</w:t>
+        </w:rPr>
+        <w:t>class_year</w:t>
       </w:r>
       <w:proofErr w:type="spellEnd"/>
       <w:r>
-        <w:rPr>
-          <w:rFonts w:ascii="TH SarabunPSK" w:hAnsi="TH SarabunPSK" w:cs="TH SarabunPSK"/>
-          <w:sz w:val="48"/>
-          <w:szCs w:val="48"/>
-        </w:rPr>
-        <w:t>}}</w:t>
-      </w:r>
-    </w:p>
-    <w:p>
-      <w:pPr>
-        <w:pStyle w:val="Heading1"/>
         <w:rPr>
           <w:rStyle w:val="Emphasis"/>
           <w:rFonts w:ascii="TH SarabunPSK" w:hAnsi="TH SarabunPSK" w:cs="TH SarabunPSK"/>
@@ -358,9 +490,9 @@
           <w:sz w:val="48"/>
           <w:szCs w:val="48"/>
         </w:rPr>
-      </w:pPr>
-    </w:p>
-    <w:p/>
+        <w:t>}}</w:t>
+      </w:r>
+    </w:p>
     <w:p>
       <w:pPr>
         <w:pStyle w:val="Heading1"/>
@@ -383,7 +515,7 @@
           <w:szCs w:val="48"/>
           <w:cs/>
         </w:rPr>
-        <w:t>ระดับ</w:t>
+        <w:t>ประจำภาคเรียนที่</w:t>
       </w:r>
       <w:r>
         <w:rPr>
@@ -398,41 +530,14 @@
       </w:r>
       <w:r>
         <w:rPr>
-          <w:rFonts w:ascii="TH SarabunPSK" w:hAnsi="TH SarabunPSK" w:cs="TH SarabunPSK"/>
-          <w:sz w:val="48"/>
-          <w:szCs w:val="48"/>
-        </w:rPr>
-        <w:t>{{</w:t>
-      </w:r>
-      <w:proofErr w:type="spellStart"/>
-      <w:r>
-        <w:rPr>
-          <w:rFonts w:ascii="TH SarabunPSK" w:hAnsi="TH SarabunPSK" w:cs="TH SarabunPSK"/>
-          <w:sz w:val="48"/>
-          <w:szCs w:val="48"/>
-        </w:rPr>
-        <w:t>education_level</w:t>
-      </w:r>
-      <w:proofErr w:type="spellEnd"/>
-      <w:r>
-        <w:rPr>
-          <w:rFonts w:ascii="TH SarabunPSK" w:hAnsi="TH SarabunPSK" w:cs="TH SarabunPSK"/>
-          <w:sz w:val="48"/>
-          <w:szCs w:val="48"/>
-        </w:rPr>
-        <w:t>}}</w:t>
-      </w:r>
-      <w:r>
-        <w:rPr>
           <w:rStyle w:val="Emphasis"/>
           <w:rFonts w:ascii="TH SarabunPSK" w:hAnsi="TH SarabunPSK" w:cs="TH SarabunPSK"/>
           <w:i w:val="0"/>
           <w:iCs w:val="0"/>
           <w:sz w:val="48"/>
           <w:szCs w:val="48"/>
-          <w:cs/>
-        </w:rPr>
-        <w:t xml:space="preserve"> ชั้นปี</w:t>
+        </w:rPr>
+        <w:t>{{semester}}</w:t>
       </w:r>
       <w:r>
         <w:rPr>
@@ -445,101 +550,6 @@
         </w:rPr>
         <w:t xml:space="preserve"> </w:t>
       </w:r>
-      <w:r>
-        <w:rPr>
-          <w:rStyle w:val="Emphasis"/>
-          <w:rFonts w:ascii="TH SarabunPSK" w:hAnsi="TH SarabunPSK" w:cs="TH SarabunPSK"/>
-          <w:i w:val="0"/>
-          <w:iCs w:val="0"/>
-          <w:sz w:val="48"/>
-          <w:szCs w:val="48"/>
-        </w:rPr>
-        <w:t>{{</w:t>
-      </w:r>
-      <w:proofErr w:type="spellStart"/>
-      <w:r>
-        <w:rPr>
-          <w:rStyle w:val="Emphasis"/>
-          <w:rFonts w:ascii="TH SarabunPSK" w:hAnsi="TH SarabunPSK" w:cs="TH SarabunPSK"/>
-          <w:i w:val="0"/>
-          <w:iCs w:val="0"/>
-          <w:sz w:val="48"/>
-          <w:szCs w:val="48"/>
-        </w:rPr>
-        <w:t>class_year</w:t>
-      </w:r>
-      <w:proofErr w:type="spellEnd"/>
-      <w:r>
-        <w:rPr>
-          <w:rStyle w:val="Emphasis"/>
-          <w:rFonts w:ascii="TH SarabunPSK" w:hAnsi="TH SarabunPSK" w:cs="TH SarabunPSK"/>
-          <w:i w:val="0"/>
-          <w:iCs w:val="0"/>
-          <w:sz w:val="48"/>
-          <w:szCs w:val="48"/>
-        </w:rPr>
-        <w:t>}}</w:t>
-      </w:r>
-    </w:p>
-    <w:p>
-      <w:pPr>
-        <w:pStyle w:val="Heading1"/>
-        <w:rPr>
-          <w:rStyle w:val="Emphasis"/>
-          <w:rFonts w:ascii="TH SarabunPSK" w:hAnsi="TH SarabunPSK" w:cs="TH SarabunPSK"/>
-          <w:i w:val="0"/>
-          <w:iCs w:val="0"/>
-          <w:sz w:val="48"/>
-          <w:szCs w:val="48"/>
-        </w:rPr>
-      </w:pPr>
-      <w:r>
-        <w:rPr>
-          <w:rStyle w:val="Emphasis"/>
-          <w:rFonts w:ascii="TH SarabunPSK" w:hAnsi="TH SarabunPSK" w:cs="TH SarabunPSK"/>
-          <w:i w:val="0"/>
-          <w:iCs w:val="0"/>
-          <w:sz w:val="48"/>
-          <w:szCs w:val="48"/>
-          <w:cs/>
-        </w:rPr>
-        <w:t>ประจำภาคเรียนที่</w:t>
-      </w:r>
-      <w:r>
-        <w:rPr>
-          <w:rStyle w:val="Emphasis"/>
-          <w:rFonts w:ascii="TH SarabunPSK" w:hAnsi="TH SarabunPSK" w:cs="TH SarabunPSK"/>
-          <w:i w:val="0"/>
-          <w:iCs w:val="0"/>
-          <w:sz w:val="48"/>
-          <w:szCs w:val="48"/>
-        </w:rPr>
-        <w:t xml:space="preserve"> </w:t>
-      </w:r>
-      <w:r>
-        <w:rPr>
-          <w:rStyle w:val="Emphasis"/>
-          <w:rFonts w:ascii="TH SarabunPSK" w:hAnsi="TH SarabunPSK" w:cs="TH SarabunPSK"/>
-          <w:i w:val="0"/>
-          <w:iCs w:val="0"/>
-          <w:sz w:val="48"/>
-          <w:szCs w:val="48"/>
-        </w:rPr>
-        <w:t>{{semester}}</w:t>
-      </w:r>
-    </w:p>
-    <w:p>
-      <w:pPr>
-        <w:pStyle w:val="Heading1"/>
-        <w:rPr>
-          <w:rStyle w:val="Emphasis"/>
-          <w:rFonts w:ascii="TH SarabunPSK" w:hAnsi="TH SarabunPSK" w:cs="TH SarabunPSK"/>
-          <w:i w:val="0"/>
-          <w:iCs w:val="0"/>
-          <w:sz w:val="48"/>
-          <w:szCs w:val="48"/>
-        </w:rPr>
-      </w:pPr>
       <w:r>
         <w:rPr>
           <w:rStyle w:val="Emphasis"/>
@@ -718,6 +728,7 @@
           <w:szCs w:val="40"/>
           <w:cs/>
         </w:rPr>
+        <w:lastRenderedPageBreak/>
         <w:t>การวิเคราะห์คุณภาพของแบบทดสอบ</w:t>
       </w:r>
     </w:p>
@@ -737,7 +748,7 @@
           <w:szCs w:val="36"/>
           <w:cs/>
         </w:rPr>
-        <w:t xml:space="preserve">รายวิชา  </w:t>
+        <w:t xml:space="preserve">รายวิชา </w:t>
       </w:r>
       <w:r>
         <w:rPr>
@@ -856,7 +867,7 @@
           <w:szCs w:val="32"/>
           <w:cs/>
         </w:rPr>
-        <w:t xml:space="preserve">  </w:t>
+        <w:t xml:space="preserve"> </w:t>
       </w:r>
       <w:r>
         <w:rPr>
@@ -889,9 +900,43 @@
           <w:rFonts w:ascii="TH SarabunPSK" w:hAnsi="TH SarabunPSK" w:cs="TH SarabunPSK"/>
           <w:sz w:val="32"/>
           <w:szCs w:val="32"/>
-          <w:cs/>
-        </w:rPr>
-        <w:t xml:space="preserve">  </w:t>
+        </w:rPr>
+        <w:t>.</w:t>
+      </w:r>
+      <w:r>
+        <w:rPr>
+          <w:rFonts w:ascii="TH SarabunPSK" w:hAnsi="TH SarabunPSK" w:cs="TH SarabunPSK"/>
+          <w:sz w:val="32"/>
+          <w:szCs w:val="32"/>
+        </w:rPr>
+        <w:t>{{</w:t>
+      </w:r>
+      <w:proofErr w:type="spellStart"/>
+      <w:r>
+        <w:rPr>
+          <w:rFonts w:ascii="TH SarabunPSK" w:hAnsi="TH SarabunPSK" w:cs="TH SarabunPSK"/>
+          <w:sz w:val="32"/>
+          <w:szCs w:val="32"/>
+        </w:rPr>
+        <w:t>class_year</w:t>
+      </w:r>
+      <w:proofErr w:type="spellEnd"/>
+      <w:r>
+        <w:rPr>
+          <w:rFonts w:ascii="TH SarabunPSK" w:hAnsi="TH SarabunPSK" w:cs="TH SarabunPSK"/>
+          <w:sz w:val="32"/>
+          <w:szCs w:val="32"/>
+        </w:rPr>
+        <w:t>}}</w:t>
+      </w:r>
+      <w:r>
+        <w:rPr>
+          <w:rFonts w:ascii="TH SarabunPSK" w:hAnsi="TH SarabunPSK" w:cs="TH SarabunPSK"/>
+          <w:sz w:val="32"/>
+          <w:szCs w:val="32"/>
+          <w:cs/>
+        </w:rPr>
+        <w:t xml:space="preserve"> </w:t>
       </w:r>
       <w:r>
         <w:rPr>
@@ -1984,7 +2029,7 @@
             <w:pPr>
               <w:jc w:val="center"/>
               <w:rPr>
-                <w:rFonts w:ascii="TH SarabunPSK" w:hAnsi="TH SarabunPSK" w:cs="TH SarabunPSK" w:hint="cs"/>
+                <w:rFonts w:ascii="TH SarabunPSK" w:hAnsi="TH SarabunPSK" w:cs="TH SarabunPSK"/>
                 <w:sz w:val="32"/>
                 <w:szCs w:val="32"/>
               </w:rPr>
@@ -2026,7 +2071,7 @@
             <w:pPr>
               <w:jc w:val="center"/>
               <w:rPr>
-                <w:rFonts w:ascii="TH SarabunPSK" w:hAnsi="TH SarabunPSK" w:cs="TH SarabunPSK" w:hint="cs"/>
+                <w:rFonts w:ascii="TH SarabunPSK" w:hAnsi="TH SarabunPSK" w:cs="TH SarabunPSK"/>
                 <w:sz w:val="36"/>
                 <w:szCs w:val="36"/>
               </w:rPr>
@@ -2068,7 +2113,7 @@
             <w:pPr>
               <w:jc w:val="center"/>
               <w:rPr>
-                <w:rFonts w:ascii="TH SarabunPSK" w:hAnsi="TH SarabunPSK" w:cs="TH SarabunPSK" w:hint="cs"/>
+                <w:rFonts w:ascii="TH SarabunPSK" w:hAnsi="TH SarabunPSK" w:cs="TH SarabunPSK"/>
                 <w:sz w:val="32"/>
                 <w:szCs w:val="32"/>
               </w:rPr>
@@ -2110,7 +2155,7 @@
             <w:pPr>
               <w:jc w:val="center"/>
               <w:rPr>
-                <w:rFonts w:ascii="TH SarabunPSK" w:hAnsi="TH SarabunPSK" w:cs="TH SarabunPSK" w:hint="cs"/>
+                <w:rFonts w:ascii="TH SarabunPSK" w:hAnsi="TH SarabunPSK" w:cs="TH SarabunPSK"/>
                 <w:sz w:val="32"/>
                 <w:szCs w:val="32"/>
               </w:rPr>
@@ -2134,7 +2179,7 @@
             <w:pPr>
               <w:jc w:val="center"/>
               <w:rPr>
-                <w:rFonts w:ascii="TH SarabunPSK" w:hAnsi="TH SarabunPSK" w:cs="TH SarabunPSK" w:hint="cs"/>
+                <w:rFonts w:ascii="TH SarabunPSK" w:hAnsi="TH SarabunPSK" w:cs="TH SarabunPSK"/>
                 <w:sz w:val="32"/>
                 <w:szCs w:val="32"/>
               </w:rPr>
@@ -2227,7 +2272,7 @@
           <w:p>
             <w:pPr>
               <w:rPr>
-                <w:rFonts w:ascii="TH SarabunPSK" w:hAnsi="TH SarabunPSK" w:cs="TH SarabunPSK" w:hint="cs"/>
+                <w:rFonts w:ascii="TH SarabunPSK" w:hAnsi="TH SarabunPSK" w:cs="TH SarabunPSK"/>
                 <w:sz w:val="32"/>
                 <w:szCs w:val="32"/>
                 <w:cs/>
@@ -2773,6 +2818,7 @@
   <w:style w:type="character" w:default="1" w:styleId="DefaultParagraphFont">
     <w:name w:val="Default Paragraph Font"/>
     <w:uiPriority w:val="1"/>
+    <w:semiHidden/>
     <w:unhideWhenUsed/>
   </w:style>
   <w:style w:type="table" w:default="1" w:styleId="TableNormal">

</xml_diff>